<commit_message>
add signniture + logo
</commit_message>
<xml_diff>
--- a/templates/modele-facture-adaroch.docx
+++ b/templates/modele-facture-adaroch.docx
@@ -80,6 +80,380 @@
           <w:lang w:val="en-US"/>
         </w:rPr>
       </w:pPr>
+      <w:r>
+        <w:rPr>
+          <w:noProof/>
+          <w:lang w:val="en-US"/>
+        </w:rPr>
+        <mc:AlternateContent>
+          <mc:Choice Requires="wps">
+            <w:drawing>
+              <wp:anchor distT="0" distB="0" distL="114300" distR="114300" simplePos="0" relativeHeight="251660288" behindDoc="0" locked="0" layoutInCell="1" allowOverlap="1" wp14:anchorId="2D1B4154" wp14:editId="6018DC1A">
+                <wp:simplePos x="0" y="0"/>
+                <wp:positionH relativeFrom="column">
+                  <wp:posOffset>4895092</wp:posOffset>
+                </wp:positionH>
+                <wp:positionV relativeFrom="paragraph">
+                  <wp:posOffset>-750859</wp:posOffset>
+                </wp:positionV>
+                <wp:extent cx="1324099" cy="1074717"/>
+                <wp:effectExtent l="0" t="0" r="0" b="0"/>
+                <wp:wrapNone/>
+                <wp:docPr id="8" name="Rectangle 8"/>
+                <wp:cNvGraphicFramePr/>
+                <a:graphic xmlns:a="http://schemas.openxmlformats.org/drawingml/2006/main">
+                  <a:graphicData uri="http://schemas.microsoft.com/office/word/2010/wordprocessingShape">
+                    <wps:wsp>
+                      <wps:cNvSpPr/>
+                      <wps:spPr>
+                        <a:xfrm>
+                          <a:off x="0" y="0"/>
+                          <a:ext cx="1324099" cy="1074717"/>
+                        </a:xfrm>
+                        <a:prstGeom prst="rect">
+                          <a:avLst/>
+                        </a:prstGeom>
+                        <a:noFill/>
+                        <a:ln>
+                          <a:noFill/>
+                        </a:ln>
+                      </wps:spPr>
+                      <wps:style>
+                        <a:lnRef idx="2">
+                          <a:schemeClr val="accent1">
+                            <a:shade val="50000"/>
+                          </a:schemeClr>
+                        </a:lnRef>
+                        <a:fillRef idx="1">
+                          <a:schemeClr val="accent1"/>
+                        </a:fillRef>
+                        <a:effectRef idx="0">
+                          <a:schemeClr val="accent1"/>
+                        </a:effectRef>
+                        <a:fontRef idx="minor">
+                          <a:schemeClr val="lt1"/>
+                        </a:fontRef>
+                      </wps:style>
+                      <wps:txbx>
+                        <w:txbxContent>
+                          <w:p>
+                            <w:pPr>
+                              <w:jc w:val="center"/>
+                            </w:pPr>
+                            <w:r>
+                              <w:rPr>
+                                <w:noProof/>
+                              </w:rPr>
+                              <w:drawing>
+                                <wp:inline distT="0" distB="0" distL="0" distR="0" wp14:anchorId="71CD8D9E" wp14:editId="5BD2CD1B">
+                                  <wp:extent cx="1031875" cy="957580"/>
+                                  <wp:effectExtent l="0" t="0" r="0" b="0"/>
+                                  <wp:docPr id="9" name="Image 9"/>
+                                  <wp:cNvGraphicFramePr>
+                                    <a:graphicFrameLocks xmlns:a="http://schemas.openxmlformats.org/drawingml/2006/main" noChangeAspect="1"/>
+                                  </wp:cNvGraphicFramePr>
+                                  <a:graphic xmlns:a="http://schemas.openxmlformats.org/drawingml/2006/main">
+                                    <a:graphicData uri="http://schemas.openxmlformats.org/drawingml/2006/picture">
+                                      <pic:pic xmlns:pic="http://schemas.openxmlformats.org/drawingml/2006/picture">
+                                        <pic:nvPicPr>
+                                          <pic:cNvPr id="9" name="logo2.jpeg"/>
+                                          <pic:cNvPicPr/>
+                                        </pic:nvPicPr>
+                                        <pic:blipFill>
+                                          <a:blip r:embed="rId7">
+                                            <a:extLst>
+                                              <a:ext uri="{28A0092B-C50C-407E-A947-70E740481C1C}">
+                                                <a14:useLocalDpi xmlns:a14="http://schemas.microsoft.com/office/drawing/2010/main" val="0"/>
+                                              </a:ext>
+                                            </a:extLst>
+                                          </a:blip>
+                                          <a:stretch>
+                                            <a:fillRect/>
+                                          </a:stretch>
+                                        </pic:blipFill>
+                                        <pic:spPr>
+                                          <a:xfrm>
+                                            <a:off x="0" y="0"/>
+                                            <a:ext cx="1031875" cy="957580"/>
+                                          </a:xfrm>
+                                          <a:prstGeom prst="rect">
+                                            <a:avLst/>
+                                          </a:prstGeom>
+                                        </pic:spPr>
+                                      </pic:pic>
+                                    </a:graphicData>
+                                  </a:graphic>
+                                </wp:inline>
+                              </w:drawing>
+                            </w:r>
+                          </w:p>
+                        </w:txbxContent>
+                      </wps:txbx>
+                      <wps:bodyPr rot="0" spcFirstLastPara="0" vertOverflow="overflow" horzOverflow="overflow" vert="horz" wrap="square" lIns="91440" tIns="45720" rIns="91440" bIns="45720" numCol="1" spcCol="0" rtlCol="0" fromWordArt="0" anchor="ctr" anchorCtr="0" forceAA="0" compatLnSpc="1">
+                        <a:prstTxWarp prst="textNoShape">
+                          <a:avLst/>
+                        </a:prstTxWarp>
+                        <a:noAutofit/>
+                      </wps:bodyPr>
+                    </wps:wsp>
+                  </a:graphicData>
+                </a:graphic>
+              </wp:anchor>
+            </w:drawing>
+          </mc:Choice>
+          <mc:Fallback>
+            <w:pict>
+              <v:rect w14:anchorId="2D1B4154" id="Rectangle 8" o:spid="_x0000_s1026" style="position:absolute;margin-left:385.45pt;margin-top:-59.1pt;width:104.25pt;height:84.6pt;z-index:251660288;visibility:visible;mso-wrap-style:square;mso-wrap-distance-left:9pt;mso-wrap-distance-top:0;mso-wrap-distance-right:9pt;mso-wrap-distance-bottom:0;mso-position-horizontal:absolute;mso-position-horizontal-relative:text;mso-position-vertical:absolute;mso-position-vertical-relative:text;v-text-anchor:middle" o:gfxdata="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" filled="f" stroked="f" strokeweight="2pt">
+                <v:textbox>
+                  <w:txbxContent>
+                    <w:p>
+                      <w:pPr>
+                        <w:jc w:val="center"/>
+                      </w:pPr>
+                      <w:r>
+                        <w:rPr>
+                          <w:noProof/>
+                        </w:rPr>
+                        <w:drawing>
+                          <wp:inline distT="0" distB="0" distL="0" distR="0" wp14:anchorId="71CD8D9E" wp14:editId="5BD2CD1B">
+                            <wp:extent cx="1031875" cy="957580"/>
+                            <wp:effectExtent l="0" t="0" r="0" b="0"/>
+                            <wp:docPr id="9" name="Image 9"/>
+                            <wp:cNvGraphicFramePr>
+                              <a:graphicFrameLocks xmlns:a="http://schemas.openxmlformats.org/drawingml/2006/main" noChangeAspect="1"/>
+                            </wp:cNvGraphicFramePr>
+                            <a:graphic xmlns:a="http://schemas.openxmlformats.org/drawingml/2006/main">
+                              <a:graphicData uri="http://schemas.openxmlformats.org/drawingml/2006/picture">
+                                <pic:pic xmlns:pic="http://schemas.openxmlformats.org/drawingml/2006/picture">
+                                  <pic:nvPicPr>
+                                    <pic:cNvPr id="9" name="logo2.jpeg"/>
+                                    <pic:cNvPicPr/>
+                                  </pic:nvPicPr>
+                                  <pic:blipFill>
+                                    <a:blip r:embed="rId7">
+                                      <a:extLst>
+                                        <a:ext uri="{28A0092B-C50C-407E-A947-70E740481C1C}">
+                                          <a14:useLocalDpi xmlns:a14="http://schemas.microsoft.com/office/drawing/2010/main" val="0"/>
+                                        </a:ext>
+                                      </a:extLst>
+                                    </a:blip>
+                                    <a:stretch>
+                                      <a:fillRect/>
+                                    </a:stretch>
+                                  </pic:blipFill>
+                                  <pic:spPr>
+                                    <a:xfrm>
+                                      <a:off x="0" y="0"/>
+                                      <a:ext cx="1031875" cy="957580"/>
+                                    </a:xfrm>
+                                    <a:prstGeom prst="rect">
+                                      <a:avLst/>
+                                    </a:prstGeom>
+                                  </pic:spPr>
+                                </pic:pic>
+                              </a:graphicData>
+                            </a:graphic>
+                          </wp:inline>
+                        </w:drawing>
+                      </w:r>
+                    </w:p>
+                  </w:txbxContent>
+                </v:textbox>
+              </v:rect>
+            </w:pict>
+          </mc:Fallback>
+        </mc:AlternateContent>
+      </w:r>
+      <w:r>
+        <w:rPr>
+          <w:noProof/>
+          <w:lang w:val="en-US"/>
+        </w:rPr>
+        <mc:AlternateContent>
+          <mc:Choice Requires="wps">
+            <w:drawing>
+              <wp:anchor distT="0" distB="0" distL="114300" distR="114300" simplePos="0" relativeHeight="251660288" behindDoc="0" locked="0" layoutInCell="1" allowOverlap="1" wp14:anchorId="21B67527" wp14:editId="1B072C5F">
+                <wp:simplePos x="0" y="0"/>
+                <wp:positionH relativeFrom="column">
+                  <wp:posOffset>-431241</wp:posOffset>
+                </wp:positionH>
+                <wp:positionV relativeFrom="paragraph">
+                  <wp:posOffset>-584658</wp:posOffset>
+                </wp:positionV>
+                <wp:extent cx="1170432" cy="921715"/>
+                <wp:effectExtent l="0" t="0" r="0" b="0"/>
+                <wp:wrapNone/>
+                <wp:docPr id="6" name="Rectangle 6"/>
+                <wp:cNvGraphicFramePr/>
+                <a:graphic xmlns:a="http://schemas.openxmlformats.org/drawingml/2006/main">
+                  <a:graphicData uri="http://schemas.microsoft.com/office/word/2010/wordprocessingShape">
+                    <wps:wsp>
+                      <wps:cNvSpPr/>
+                      <wps:spPr>
+                        <a:xfrm>
+                          <a:off x="0" y="0"/>
+                          <a:ext cx="1170432" cy="921715"/>
+                        </a:xfrm>
+                        <a:prstGeom prst="rect">
+                          <a:avLst/>
+                        </a:prstGeom>
+                        <a:noFill/>
+                        <a:ln>
+                          <a:noFill/>
+                        </a:ln>
+                      </wps:spPr>
+                      <wps:style>
+                        <a:lnRef idx="2">
+                          <a:schemeClr val="accent1">
+                            <a:shade val="50000"/>
+                          </a:schemeClr>
+                        </a:lnRef>
+                        <a:fillRef idx="1">
+                          <a:schemeClr val="accent1"/>
+                        </a:fillRef>
+                        <a:effectRef idx="0">
+                          <a:schemeClr val="accent1"/>
+                        </a:effectRef>
+                        <a:fontRef idx="minor">
+                          <a:schemeClr val="lt1"/>
+                        </a:fontRef>
+                      </wps:style>
+                      <wps:txbx>
+                        <w:txbxContent>
+                          <w:p>
+                            <w:pPr>
+                              <w:jc w:val="center"/>
+                            </w:pPr>
+                            <w:r>
+                              <w:rPr>
+                                <w:noProof/>
+                              </w:rPr>
+                              <w:drawing>
+                                <wp:inline distT="0" distB="0" distL="0" distR="0" wp14:anchorId="643D679F" wp14:editId="415E391D">
+                                  <wp:extent cx="913594" cy="883020"/>
+                                  <wp:effectExtent l="0" t="0" r="1270" b="0"/>
+                                  <wp:docPr id="7" name="Image 7"/>
+                                  <wp:cNvGraphicFramePr>
+                                    <a:graphicFrameLocks xmlns:a="http://schemas.openxmlformats.org/drawingml/2006/main" noChangeAspect="1"/>
+                                  </wp:cNvGraphicFramePr>
+                                  <a:graphic xmlns:a="http://schemas.openxmlformats.org/drawingml/2006/main">
+                                    <a:graphicData uri="http://schemas.openxmlformats.org/drawingml/2006/picture">
+                                      <pic:pic xmlns:pic="http://schemas.openxmlformats.org/drawingml/2006/picture">
+                                        <pic:nvPicPr>
+                                          <pic:cNvPr id="7" name="logo1.jpeg"/>
+                                          <pic:cNvPicPr/>
+                                        </pic:nvPicPr>
+                                        <pic:blipFill>
+                                          <a:blip r:embed="rId8">
+                                            <a:extLst>
+                                              <a:ext uri="{28A0092B-C50C-407E-A947-70E740481C1C}">
+                                                <a14:useLocalDpi xmlns:a14="http://schemas.microsoft.com/office/drawing/2010/main" val="0"/>
+                                              </a:ext>
+                                            </a:extLst>
+                                          </a:blip>
+                                          <a:stretch>
+                                            <a:fillRect/>
+                                          </a:stretch>
+                                        </pic:blipFill>
+                                        <pic:spPr>
+                                          <a:xfrm>
+                                            <a:off x="0" y="0"/>
+                                            <a:ext cx="913594" cy="883020"/>
+                                          </a:xfrm>
+                                          <a:prstGeom prst="rect">
+                                            <a:avLst/>
+                                          </a:prstGeom>
+                                        </pic:spPr>
+                                      </pic:pic>
+                                    </a:graphicData>
+                                  </a:graphic>
+                                </wp:inline>
+                              </w:drawing>
+                            </w:r>
+                          </w:p>
+                        </w:txbxContent>
+                      </wps:txbx>
+                      <wps:bodyPr rot="0" spcFirstLastPara="0" vertOverflow="overflow" horzOverflow="overflow" vert="horz" wrap="square" lIns="91440" tIns="45720" rIns="91440" bIns="45720" numCol="1" spcCol="0" rtlCol="0" fromWordArt="0" anchor="ctr" anchorCtr="0" forceAA="0" compatLnSpc="1">
+                        <a:prstTxWarp prst="textNoShape">
+                          <a:avLst/>
+                        </a:prstTxWarp>
+                        <a:noAutofit/>
+                      </wps:bodyPr>
+                    </wps:wsp>
+                  </a:graphicData>
+                </a:graphic>
+                <wp14:sizeRelH relativeFrom="margin">
+                  <wp14:pctWidth>0</wp14:pctWidth>
+                </wp14:sizeRelH>
+                <wp14:sizeRelV relativeFrom="margin">
+                  <wp14:pctHeight>0</wp14:pctHeight>
+                </wp14:sizeRelV>
+              </wp:anchor>
+            </w:drawing>
+          </mc:Choice>
+          <mc:Fallback>
+            <w:pict>
+              <v:rect w14:anchorId="21B67527" id="Rectangle 6" o:spid="_x0000_s1027" style="position:absolute;margin-left:-33.95pt;margin-top:-46.05pt;width:92.15pt;height:72.6pt;z-index:251660288;visibility:visible;mso-wrap-style:square;mso-width-percent:0;mso-height-percent:0;mso-wrap-distance-left:9pt;mso-wrap-distance-top:0;mso-wrap-distance-right:9pt;mso-wrap-distance-bottom:0;mso-position-horizontal:absolute;mso-position-horizontal-relative:text;mso-position-vertical:absolute;mso-position-vertical-relative:text;mso-width-percent:0;mso-height-percent:0;mso-width-relative:margin;mso-height-relative:margin;v-text-anchor:middle" o:gfxdata="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" filled="f" stroked="f" strokeweight="2pt">
+                <v:textbox>
+                  <w:txbxContent>
+                    <w:p>
+                      <w:pPr>
+                        <w:jc w:val="center"/>
+                      </w:pPr>
+                      <w:r>
+                        <w:rPr>
+                          <w:noProof/>
+                        </w:rPr>
+                        <w:drawing>
+                          <wp:inline distT="0" distB="0" distL="0" distR="0" wp14:anchorId="643D679F" wp14:editId="415E391D">
+                            <wp:extent cx="913594" cy="883020"/>
+                            <wp:effectExtent l="0" t="0" r="1270" b="0"/>
+                            <wp:docPr id="7" name="Image 7"/>
+                            <wp:cNvGraphicFramePr>
+                              <a:graphicFrameLocks xmlns:a="http://schemas.openxmlformats.org/drawingml/2006/main" noChangeAspect="1"/>
+                            </wp:cNvGraphicFramePr>
+                            <a:graphic xmlns:a="http://schemas.openxmlformats.org/drawingml/2006/main">
+                              <a:graphicData uri="http://schemas.openxmlformats.org/drawingml/2006/picture">
+                                <pic:pic xmlns:pic="http://schemas.openxmlformats.org/drawingml/2006/picture">
+                                  <pic:nvPicPr>
+                                    <pic:cNvPr id="7" name="logo1.jpeg"/>
+                                    <pic:cNvPicPr/>
+                                  </pic:nvPicPr>
+                                  <pic:blipFill>
+                                    <a:blip r:embed="rId8">
+                                      <a:extLst>
+                                        <a:ext uri="{28A0092B-C50C-407E-A947-70E740481C1C}">
+                                          <a14:useLocalDpi xmlns:a14="http://schemas.microsoft.com/office/drawing/2010/main" val="0"/>
+                                        </a:ext>
+                                      </a:extLst>
+                                    </a:blip>
+                                    <a:stretch>
+                                      <a:fillRect/>
+                                    </a:stretch>
+                                  </pic:blipFill>
+                                  <pic:spPr>
+                                    <a:xfrm>
+                                      <a:off x="0" y="0"/>
+                                      <a:ext cx="913594" cy="883020"/>
+                                    </a:xfrm>
+                                    <a:prstGeom prst="rect">
+                                      <a:avLst/>
+                                    </a:prstGeom>
+                                  </pic:spPr>
+                                </pic:pic>
+                              </a:graphicData>
+                            </a:graphic>
+                          </wp:inline>
+                        </w:drawing>
+                      </w:r>
+                    </w:p>
+                  </w:txbxContent>
+                </v:textbox>
+              </v:rect>
+            </w:pict>
+          </mc:Fallback>
+        </mc:AlternateContent>
+      </w:r>
     </w:p>
     <w:p/>
     <w:tbl>
@@ -111,7 +485,7 @@
         </w:trPr>
         <w:tc>
           <w:tcPr>
-            <w:tcW w:w="1841" w:type="dxa"/>
+            <w:tcW w:w="1754" w:type="dxa"/>
             <w:tcBorders>
               <w:bottom w:val="single" w:sz="4" w:space="0" w:color="auto"/>
             </w:tcBorders>
@@ -139,7 +513,7 @@
         </w:tc>
         <w:tc>
           <w:tcPr>
-            <w:tcW w:w="1523" w:type="dxa"/>
+            <w:tcW w:w="1507" w:type="dxa"/>
           </w:tcPr>
           <w:p>
             <w:pPr>
@@ -164,7 +538,7 @@
         </w:tc>
         <w:tc>
           <w:tcPr>
-            <w:tcW w:w="1987" w:type="dxa"/>
+            <w:tcW w:w="1864" w:type="dxa"/>
             <w:shd w:val="clear" w:color="auto" w:fill="auto"/>
           </w:tcPr>
           <w:p>
@@ -210,7 +584,7 @@
         </w:trPr>
         <w:tc>
           <w:tcPr>
-            <w:tcW w:w="1841" w:type="dxa"/>
+            <w:tcW w:w="1754" w:type="dxa"/>
             <w:tcBorders>
               <w:left w:val="single" w:sz="4" w:space="0" w:color="auto"/>
               <w:bottom w:val="single" w:sz="4" w:space="0" w:color="auto"/>
@@ -260,7 +634,7 @@
         </w:tc>
         <w:tc>
           <w:tcPr>
-            <w:tcW w:w="1523" w:type="dxa"/>
+            <w:tcW w:w="1507" w:type="dxa"/>
             <w:tcBorders>
               <w:left w:val="single" w:sz="4" w:space="0" w:color="auto"/>
             </w:tcBorders>
@@ -308,7 +682,7 @@
         </w:tc>
         <w:tc>
           <w:tcPr>
-            <w:tcW w:w="1987" w:type="dxa"/>
+            <w:tcW w:w="1864" w:type="dxa"/>
             <w:shd w:val="clear" w:color="auto" w:fill="auto"/>
           </w:tcPr>
           <w:p>
@@ -354,10 +728,9 @@
         </w:tc>
       </w:tr>
     </w:tbl>
-    <w:p/>
     <w:tbl>
       <w:tblPr>
-        <w:tblpPr w:leftFromText="141" w:rightFromText="141" w:vertAnchor="text" w:horzAnchor="margin" w:tblpXSpec="right" w:tblpY="-62"/>
+        <w:tblpPr w:leftFromText="141" w:rightFromText="141" w:vertAnchor="text" w:horzAnchor="margin" w:tblpXSpec="right" w:tblpY="297"/>
         <w:tblW w:w="0" w:type="auto"/>
         <w:tblBorders>
           <w:top w:val="single" w:sz="4" w:space="0" w:color="auto"/>
@@ -437,6 +810,7 @@
         </w:tc>
       </w:tr>
     </w:tbl>
+    <w:p/>
     <w:p/>
     <w:p>
       <w:pPr>
@@ -744,14 +1118,14 @@
       <w:tblPr>
         <w:tblStyle w:val="Grilledutableau"/>
         <w:tblpPr w:leftFromText="141" w:rightFromText="141" w:vertAnchor="text" w:horzAnchor="margin" w:tblpXSpec="center" w:tblpY="1230"/>
-        <w:tblW w:w="9223" w:type="dxa"/>
+        <w:tblW w:w="9047" w:type="dxa"/>
         <w:tblLook w:val="04A0" w:firstRow="1" w:lastRow="0" w:firstColumn="1" w:lastColumn="0" w:noHBand="0" w:noVBand="1"/>
       </w:tblPr>
       <w:tblGrid>
-        <w:gridCol w:w="4492"/>
+        <w:gridCol w:w="4569"/>
         <w:gridCol w:w="1256"/>
-        <w:gridCol w:w="1417"/>
-        <w:gridCol w:w="2058"/>
+        <w:gridCol w:w="1317"/>
+        <w:gridCol w:w="1905"/>
       </w:tblGrid>
       <w:tr>
         <w:trPr>
@@ -759,7 +1133,7 @@
         </w:trPr>
         <w:tc>
           <w:tcPr>
-            <w:tcW w:w="4492" w:type="dxa"/>
+            <w:tcW w:w="4810" w:type="dxa"/>
             <w:shd w:val="clear" w:color="auto" w:fill="D9D9D9" w:themeFill="background1" w:themeFillShade="D9"/>
           </w:tcPr>
           <w:p>
@@ -807,7 +1181,7 @@
         </w:tc>
         <w:tc>
           <w:tcPr>
-            <w:tcW w:w="1417" w:type="dxa"/>
+            <w:tcW w:w="1242" w:type="dxa"/>
             <w:shd w:val="clear" w:color="auto" w:fill="D9D9D9" w:themeFill="background1" w:themeFillShade="D9"/>
           </w:tcPr>
           <w:p>
@@ -831,7 +1205,7 @@
         </w:tc>
         <w:tc>
           <w:tcPr>
-            <w:tcW w:w="2058" w:type="dxa"/>
+            <w:tcW w:w="1739" w:type="dxa"/>
             <w:shd w:val="clear" w:color="auto" w:fill="D9D9D9" w:themeFill="background1" w:themeFillShade="D9"/>
           </w:tcPr>
           <w:p>
@@ -859,24 +1233,21 @@
         </w:trPr>
         <w:tc>
           <w:tcPr>
-            <w:tcW w:w="4492" w:type="dxa"/>
+            <w:tcW w:w="4810" w:type="dxa"/>
           </w:tcPr>
           <w:p>
             <w:pPr>
-              <w:spacing w:line="360" w:lineRule="auto"/>
-              <w:rPr>
-                <w:rFonts w:ascii="Arial Black" w:hAnsi="Arial Black"/>
-                <w:b/>
-                <w:bCs/>
-                <w:sz w:val="24"/>
-                <w:szCs w:val="24"/>
+              <w:rPr>
+                <w:rFonts w:ascii="Arial Black" w:hAnsi="Arial Black"/>
+                <w:b/>
+                <w:bCs/>
+                <w:sz w:val="20"/>
+                <w:szCs w:val="20"/>
               </w:rPr>
             </w:pPr>
             <w:r>
               <w:rPr>
                 <w:rFonts w:ascii="Arial" w:eastAsia="Arial" w:hAnsi="Arial" w:cs="Arial"/>
-                <w:sz w:val="24"/>
-                <w:szCs w:val="24"/>
               </w:rPr>
               <w:t>{#</w:t>
             </w:r>
@@ -885,8 +1256,6 @@
             <w:r>
               <w:rPr>
                 <w:rFonts w:ascii="Arial" w:eastAsia="Arial" w:hAnsi="Arial" w:cs="Arial"/>
-                <w:sz w:val="24"/>
-                <w:szCs w:val="24"/>
               </w:rPr>
               <w:t>lines</w:t>
             </w:r>
@@ -894,8 +1263,6 @@
             <w:r>
               <w:rPr>
                 <w:rFonts w:ascii="Arial" w:eastAsia="Arial" w:hAnsi="Arial" w:cs="Arial"/>
-                <w:sz w:val="24"/>
-                <w:szCs w:val="24"/>
               </w:rPr>
               <w:t>}{</w:t>
             </w:r>
@@ -903,8 +1270,6 @@
             <w:r>
               <w:rPr>
                 <w:rFonts w:ascii="Arial" w:eastAsia="Arial" w:hAnsi="Arial" w:cs="Arial"/>
-                <w:sz w:val="24"/>
-                <w:szCs w:val="24"/>
               </w:rPr>
               <w:t>description}</w:t>
             </w:r>
@@ -916,20 +1281,18 @@
           </w:tcPr>
           <w:p>
             <w:pPr>
-              <w:spacing w:line="360" w:lineRule="auto"/>
-              <w:rPr>
-                <w:rFonts w:ascii="Arial Black" w:hAnsi="Arial Black"/>
-                <w:b/>
-                <w:bCs/>
-                <w:sz w:val="24"/>
-                <w:szCs w:val="24"/>
+              <w:jc w:val="center"/>
+              <w:rPr>
+                <w:rFonts w:ascii="Arial Black" w:hAnsi="Arial Black"/>
+                <w:b/>
+                <w:bCs/>
+                <w:sz w:val="20"/>
+                <w:szCs w:val="20"/>
               </w:rPr>
             </w:pPr>
             <w:r>
               <w:rPr>
                 <w:rFonts w:ascii="Arial" w:eastAsia="Arial" w:hAnsi="Arial" w:cs="Arial"/>
-                <w:sz w:val="24"/>
-                <w:szCs w:val="24"/>
               </w:rPr>
               <w:t>{</w:t>
             </w:r>
@@ -938,8 +1301,6 @@
             <w:r>
               <w:rPr>
                 <w:rFonts w:ascii="Arial" w:eastAsia="Arial" w:hAnsi="Arial" w:cs="Arial"/>
-                <w:sz w:val="24"/>
-                <w:szCs w:val="24"/>
               </w:rPr>
               <w:t>quantity</w:t>
             </w:r>
@@ -948,8 +1309,6 @@
             <w:r>
               <w:rPr>
                 <w:rFonts w:ascii="Arial" w:eastAsia="Arial" w:hAnsi="Arial" w:cs="Arial"/>
-                <w:sz w:val="24"/>
-                <w:szCs w:val="24"/>
               </w:rPr>
               <w:t>}</w:t>
             </w:r>
@@ -957,24 +1316,21 @@
         </w:tc>
         <w:tc>
           <w:tcPr>
-            <w:tcW w:w="1417" w:type="dxa"/>
+            <w:tcW w:w="1242" w:type="dxa"/>
           </w:tcPr>
           <w:p>
             <w:pPr>
-              <w:spacing w:line="360" w:lineRule="auto"/>
-              <w:rPr>
-                <w:rFonts w:ascii="Arial Black" w:hAnsi="Arial Black"/>
-                <w:b/>
-                <w:bCs/>
-                <w:sz w:val="24"/>
-                <w:szCs w:val="24"/>
+              <w:rPr>
+                <w:rFonts w:ascii="Arial Black" w:hAnsi="Arial Black"/>
+                <w:b/>
+                <w:bCs/>
+                <w:sz w:val="20"/>
+                <w:szCs w:val="20"/>
               </w:rPr>
             </w:pPr>
             <w:r>
               <w:rPr>
                 <w:rFonts w:ascii="Arial" w:eastAsia="Arial" w:hAnsi="Arial" w:cs="Arial"/>
-                <w:sz w:val="24"/>
-                <w:szCs w:val="24"/>
               </w:rPr>
               <w:t>{</w:t>
             </w:r>
@@ -983,8 +1339,6 @@
             <w:r>
               <w:rPr>
                 <w:rFonts w:ascii="Arial" w:eastAsia="Arial" w:hAnsi="Arial" w:cs="Arial"/>
-                <w:sz w:val="24"/>
-                <w:szCs w:val="24"/>
               </w:rPr>
               <w:t>unit</w:t>
             </w:r>
@@ -992,8 +1346,6 @@
             <w:r>
               <w:rPr>
                 <w:rFonts w:ascii="Arial" w:eastAsia="Arial" w:hAnsi="Arial" w:cs="Arial"/>
-                <w:sz w:val="24"/>
-                <w:szCs w:val="24"/>
               </w:rPr>
               <w:t>_price</w:t>
             </w:r>
@@ -1001,8 +1353,6 @@
             <w:r>
               <w:rPr>
                 <w:rFonts w:ascii="Arial" w:eastAsia="Arial" w:hAnsi="Arial" w:cs="Arial"/>
-                <w:sz w:val="24"/>
-                <w:szCs w:val="24"/>
               </w:rPr>
               <w:t>}</w:t>
             </w:r>
@@ -1010,24 +1360,21 @@
         </w:tc>
         <w:tc>
           <w:tcPr>
-            <w:tcW w:w="2058" w:type="dxa"/>
+            <w:tcW w:w="1739" w:type="dxa"/>
           </w:tcPr>
           <w:p>
             <w:pPr>
-              <w:spacing w:line="360" w:lineRule="auto"/>
-              <w:rPr>
-                <w:rFonts w:ascii="Arial Black" w:hAnsi="Arial Black"/>
-                <w:b/>
-                <w:bCs/>
-                <w:sz w:val="24"/>
-                <w:szCs w:val="24"/>
+              <w:rPr>
+                <w:rFonts w:ascii="Arial Black" w:hAnsi="Arial Black"/>
+                <w:b/>
+                <w:bCs/>
+                <w:sz w:val="20"/>
+                <w:szCs w:val="20"/>
               </w:rPr>
             </w:pPr>
             <w:r>
               <w:rPr>
                 <w:rFonts w:ascii="Arial" w:eastAsia="Arial" w:hAnsi="Arial" w:cs="Arial"/>
-                <w:sz w:val="24"/>
-                <w:szCs w:val="24"/>
               </w:rPr>
               <w:t>{</w:t>
             </w:r>
@@ -1036,8 +1383,6 @@
             <w:r>
               <w:rPr>
                 <w:rFonts w:ascii="Arial" w:eastAsia="Arial" w:hAnsi="Arial" w:cs="Arial"/>
-                <w:sz w:val="24"/>
-                <w:szCs w:val="24"/>
               </w:rPr>
               <w:t>line</w:t>
             </w:r>
@@ -1045,8 +1390,6 @@
             <w:r>
               <w:rPr>
                 <w:rFonts w:ascii="Arial" w:eastAsia="Arial" w:hAnsi="Arial" w:cs="Arial"/>
-                <w:sz w:val="24"/>
-                <w:szCs w:val="24"/>
               </w:rPr>
               <w:t>_total</w:t>
             </w:r>
@@ -1054,8 +1397,6 @@
             <w:r>
               <w:rPr>
                 <w:rFonts w:ascii="Arial" w:eastAsia="Arial" w:hAnsi="Arial" w:cs="Arial"/>
-                <w:sz w:val="24"/>
-                <w:szCs w:val="24"/>
               </w:rPr>
               <w:t>}{/</w:t>
             </w:r>
@@ -1063,8 +1404,6 @@
             <w:r>
               <w:rPr>
                 <w:rFonts w:ascii="Arial" w:eastAsia="Arial" w:hAnsi="Arial" w:cs="Arial"/>
-                <w:sz w:val="24"/>
-                <w:szCs w:val="24"/>
               </w:rPr>
               <w:t>lines</w:t>
             </w:r>
@@ -1072,8 +1411,6 @@
             <w:r>
               <w:rPr>
                 <w:rFonts w:ascii="Arial" w:eastAsia="Arial" w:hAnsi="Arial" w:cs="Arial"/>
-                <w:sz w:val="24"/>
-                <w:szCs w:val="24"/>
               </w:rPr>
               <w:t>}</w:t>
             </w:r>
@@ -1219,15 +1556,15 @@
     <w:tbl>
       <w:tblPr>
         <w:tblStyle w:val="Grilledutableau"/>
-        <w:tblpPr w:leftFromText="141" w:rightFromText="141" w:vertAnchor="text" w:horzAnchor="margin" w:tblpY="5175"/>
+        <w:tblpPr w:leftFromText="141" w:rightFromText="141" w:vertAnchor="text" w:horzAnchor="margin" w:tblpY="2561"/>
         <w:tblOverlap w:val="never"/>
-        <w:tblW w:w="9322" w:type="dxa"/>
+        <w:tblW w:w="9180" w:type="dxa"/>
         <w:tblLook w:val="04A0" w:firstRow="1" w:lastRow="0" w:firstColumn="1" w:lastColumn="0" w:noHBand="0" w:noVBand="1"/>
       </w:tblPr>
       <w:tblGrid>
         <w:gridCol w:w="2734"/>
         <w:gridCol w:w="2976"/>
-        <w:gridCol w:w="3612"/>
+        <w:gridCol w:w="3470"/>
       </w:tblGrid>
       <w:tr>
         <w:trPr>
@@ -1316,7 +1653,7 @@
         </w:tc>
         <w:tc>
           <w:tcPr>
-            <w:tcW w:w="3612" w:type="dxa"/>
+            <w:tcW w:w="3470" w:type="dxa"/>
             <w:shd w:val="clear" w:color="auto" w:fill="D9D9D9" w:themeFill="background1" w:themeFillShade="D9"/>
           </w:tcPr>
           <w:p>
@@ -1376,8 +1713,6 @@
                 <w:rFonts w:ascii="Arial Black" w:hAnsi="Arial Black"/>
                 <w:b/>
                 <w:bCs/>
-                <w:sz w:val="24"/>
-                <w:szCs w:val="24"/>
               </w:rPr>
               <w:tab/>
             </w:r>
@@ -1386,8 +1721,6 @@
                 <w:rFonts w:ascii="Arial" w:eastAsia="Arial" w:hAnsi="Arial" w:cs="Arial"/>
                 <w:b/>
                 <w:bCs/>
-                <w:sz w:val="24"/>
-                <w:szCs w:val="24"/>
               </w:rPr>
               <w:t>{</w:t>
             </w:r>
@@ -1398,8 +1731,6 @@
                 <w:rFonts w:ascii="Arial" w:eastAsia="Arial" w:hAnsi="Arial" w:cs="Arial"/>
                 <w:b/>
                 <w:bCs/>
-                <w:sz w:val="24"/>
-                <w:szCs w:val="24"/>
               </w:rPr>
               <w:t>ht</w:t>
             </w:r>
@@ -1410,8 +1741,6 @@
                 <w:rFonts w:ascii="Arial" w:eastAsia="Arial" w:hAnsi="Arial" w:cs="Arial"/>
                 <w:b/>
                 <w:bCs/>
-                <w:sz w:val="24"/>
-                <w:szCs w:val="24"/>
               </w:rPr>
               <w:t>}</w:t>
             </w:r>
@@ -1438,8 +1767,6 @@
                 <w:rFonts w:ascii="Arial" w:eastAsia="Arial" w:hAnsi="Arial" w:cs="Arial"/>
                 <w:b/>
                 <w:bCs/>
-                <w:sz w:val="24"/>
-                <w:szCs w:val="24"/>
               </w:rPr>
               <w:t>{</w:t>
             </w:r>
@@ -1449,8 +1776,6 @@
                 <w:rFonts w:ascii="Arial" w:eastAsia="Arial" w:hAnsi="Arial" w:cs="Arial"/>
                 <w:b/>
                 <w:bCs/>
-                <w:sz w:val="24"/>
-                <w:szCs w:val="24"/>
               </w:rPr>
               <w:t>tva</w:t>
             </w:r>
@@ -1460,8 +1785,6 @@
                 <w:rFonts w:ascii="Arial" w:eastAsia="Arial" w:hAnsi="Arial" w:cs="Arial"/>
                 <w:b/>
                 <w:bCs/>
-                <w:sz w:val="24"/>
-                <w:szCs w:val="24"/>
               </w:rPr>
               <w:t>}</w:t>
             </w:r>
@@ -1469,7 +1792,7 @@
         </w:tc>
         <w:tc>
           <w:tcPr>
-            <w:tcW w:w="3612" w:type="dxa"/>
+            <w:tcW w:w="3470" w:type="dxa"/>
           </w:tcPr>
           <w:p>
             <w:pPr>
@@ -1485,8 +1808,6 @@
                 <w:rFonts w:ascii="Arial" w:eastAsia="Arial" w:hAnsi="Arial" w:cs="Arial"/>
                 <w:b/>
                 <w:bCs/>
-                <w:sz w:val="24"/>
-                <w:szCs w:val="24"/>
               </w:rPr>
               <w:t>{</w:t>
             </w:r>
@@ -1496,8 +1817,6 @@
                 <w:rFonts w:ascii="Arial" w:eastAsia="Arial" w:hAnsi="Arial" w:cs="Arial"/>
                 <w:b/>
                 <w:bCs/>
-                <w:sz w:val="24"/>
-                <w:szCs w:val="24"/>
               </w:rPr>
               <w:t>ttc</w:t>
             </w:r>
@@ -1507,8 +1826,6 @@
                 <w:rFonts w:ascii="Arial" w:eastAsia="Arial" w:hAnsi="Arial" w:cs="Arial"/>
                 <w:b/>
                 <w:bCs/>
-                <w:sz w:val="24"/>
-                <w:szCs w:val="24"/>
               </w:rPr>
               <w:t>}</w:t>
             </w:r>
@@ -1518,15 +1835,140 @@
     </w:tbl>
     <w:p>
       <w:pPr>
-        <w:tabs>
-          <w:tab w:val="left" w:pos="567"/>
-        </w:tabs>
+        <w:pStyle w:val="NormalWeb"/>
+      </w:pPr>
+    </w:p>
+    <w:p>
+      <w:pPr>
+        <w:pStyle w:val="NormalWeb"/>
       </w:pPr>
       <w:bookmarkStart w:id="0" w:name="_GoBack"/>
       <w:bookmarkEnd w:id="0"/>
     </w:p>
+    <w:p>
+      <w:pPr>
+        <w:pStyle w:val="NormalWeb"/>
+      </w:pPr>
+    </w:p>
+    <w:p>
+      <w:pPr>
+        <w:tabs>
+          <w:tab w:val="left" w:pos="567"/>
+        </w:tabs>
+        <w:jc w:val="center"/>
+      </w:pPr>
+    </w:p>
+    <w:p>
+      <w:pPr>
+        <w:tabs>
+          <w:tab w:val="left" w:pos="567"/>
+        </w:tabs>
+        <w:jc w:val="center"/>
+      </w:pPr>
+    </w:p>
+    <w:p>
+      <w:pPr>
+        <w:tabs>
+          <w:tab w:val="left" w:pos="567"/>
+        </w:tabs>
+        <w:jc w:val="center"/>
+      </w:pPr>
+    </w:p>
+    <w:p>
+      <w:pPr>
+        <w:tabs>
+          <w:tab w:val="left" w:pos="567"/>
+        </w:tabs>
+        <w:jc w:val="center"/>
+      </w:pPr>
+    </w:p>
+    <w:p>
+      <w:pPr>
+        <w:tabs>
+          <w:tab w:val="left" w:pos="567"/>
+        </w:tabs>
+        <w:jc w:val="center"/>
+      </w:pPr>
+    </w:p>
+    <w:p>
+      <w:pPr>
+        <w:tabs>
+          <w:tab w:val="left" w:pos="567"/>
+        </w:tabs>
+        <w:jc w:val="center"/>
+      </w:pPr>
+    </w:p>
+    <w:p>
+      <w:pPr>
+        <w:tabs>
+          <w:tab w:val="left" w:pos="567"/>
+        </w:tabs>
+        <w:jc w:val="center"/>
+      </w:pPr>
+    </w:p>
+    <w:p>
+      <w:pPr>
+        <w:tabs>
+          <w:tab w:val="left" w:pos="567"/>
+        </w:tabs>
+        <w:jc w:val="right"/>
+      </w:pPr>
+      <w:r>
+        <w:rPr>
+          <w:noProof/>
+        </w:rPr>
+        <w:drawing>
+          <wp:inline distT="0" distB="0" distL="0" distR="0" wp14:anchorId="1AF8E646" wp14:editId="504F0F06">
+            <wp:extent cx="1425741" cy="1504950"/>
+            <wp:effectExtent l="0" t="0" r="0" b="0"/>
+            <wp:docPr id="2" name="Image 2" descr="C:\Users\dell\Desktop\ADAROCH-app\signature-removebg-preview.png"/>
+            <wp:cNvGraphicFramePr>
+              <a:graphicFrameLocks xmlns:a="http://schemas.openxmlformats.org/drawingml/2006/main" noChangeAspect="1"/>
+            </wp:cNvGraphicFramePr>
+            <a:graphic xmlns:a="http://schemas.openxmlformats.org/drawingml/2006/main">
+              <a:graphicData uri="http://schemas.openxmlformats.org/drawingml/2006/picture">
+                <pic:pic xmlns:pic="http://schemas.openxmlformats.org/drawingml/2006/picture">
+                  <pic:nvPicPr>
+                    <pic:cNvPr id="0" name="Picture 1" descr="C:\Users\dell\Desktop\ADAROCH-app\signature-removebg-preview.png"/>
+                    <pic:cNvPicPr>
+                      <a:picLocks noChangeAspect="1" noChangeArrowheads="1"/>
+                    </pic:cNvPicPr>
+                  </pic:nvPicPr>
+                  <pic:blipFill>
+                    <a:blip r:embed="rId9" cstate="print">
+                      <a:extLst>
+                        <a:ext uri="{28A0092B-C50C-407E-A947-70E740481C1C}">
+                          <a14:useLocalDpi xmlns:a14="http://schemas.microsoft.com/office/drawing/2010/main" val="0"/>
+                        </a:ext>
+                      </a:extLst>
+                    </a:blip>
+                    <a:srcRect/>
+                    <a:stretch>
+                      <a:fillRect/>
+                    </a:stretch>
+                  </pic:blipFill>
+                  <pic:spPr bwMode="auto">
+                    <a:xfrm>
+                      <a:off x="0" y="0"/>
+                      <a:ext cx="1490148" cy="1572936"/>
+                    </a:xfrm>
+                    <a:prstGeom prst="rect">
+                      <a:avLst/>
+                    </a:prstGeom>
+                    <a:noFill/>
+                    <a:ln>
+                      <a:noFill/>
+                    </a:ln>
+                  </pic:spPr>
+                </pic:pic>
+              </a:graphicData>
+            </a:graphic>
+          </wp:inline>
+        </w:drawing>
+      </w:r>
+    </w:p>
     <w:sectPr>
-      <w:headerReference w:type="default" r:id="rId7"/>
+      <w:headerReference w:type="default" r:id="rId10"/>
       <w:pgSz w:w="11906" w:h="16838"/>
       <w:pgMar w:top="1417" w:right="1417" w:bottom="1417" w:left="1417" w:header="708" w:footer="708" w:gutter="0"/>
       <w:cols w:space="708"/>
@@ -2097,6 +2539,23 @@
     <w:uiPriority w:val="99"/>
     <w:rsid w:val="004E7FF9"/>
   </w:style>
+  <w:style w:type="paragraph" w:styleId="NormalWeb">
+    <w:name w:val="Normal (Web)"/>
+    <w:basedOn w:val="Normal"/>
+    <w:uiPriority w:val="99"/>
+    <w:semiHidden/>
+    <w:unhideWhenUsed/>
+    <w:rsid w:val="0071226F"/>
+    <w:pPr>
+      <w:spacing w:before="100" w:beforeAutospacing="1" w:after="100" w:afterAutospacing="1" w:line="240" w:lineRule="auto"/>
+    </w:pPr>
+    <w:rPr>
+      <w:rFonts w:ascii="Times New Roman" w:eastAsia="Times New Roman" w:hAnsi="Times New Roman" w:cs="Times New Roman"/>
+      <w:sz w:val="24"/>
+      <w:szCs w:val="24"/>
+      <w:lang w:eastAsia="fr-FR"/>
+    </w:rPr>
+  </w:style>
 </w:styles>
 </file>
 
@@ -2390,7 +2849,7 @@
 </file>
 
 <file path=customXml/itemProps1.xml><?xml version="1.0" encoding="utf-8"?>
-<ds:datastoreItem xmlns:ds="http://schemas.openxmlformats.org/officeDocument/2006/customXml" ds:itemID="{567BB7AB-EF2E-4F3C-8E99-C7CF2F542BFA}">
+<ds:datastoreItem xmlns:ds="http://schemas.openxmlformats.org/officeDocument/2006/customXml" ds:itemID="{2C6EAAC2-6809-411D-A486-DC518D5ACF0E}">
   <ds:schemaRefs>
     <ds:schemaRef ds:uri="http://schemas.openxmlformats.org/officeDocument/2006/bibliography"/>
   </ds:schemaRefs>

</xml_diff>

<commit_message>
edit to RIB + Signature
</commit_message>
<xml_diff>
--- a/templates/modele-facture-adaroch.docx
+++ b/templates/modele-facture-adaroch.docx
@@ -1087,7 +1087,27 @@
                 <w:szCs w:val="18"/>
                 <w:lang w:val="en-US"/>
               </w:rPr>
-              <w:t xml:space="preserve"> N° 022640000215002996059421</w:t>
+              <w:t xml:space="preserve"> N° 0226400002150029</w:t>
+            </w:r>
+            <w:r>
+              <w:rPr>
+                <w:b/>
+                <w:bCs/>
+                <w:sz w:val="18"/>
+                <w:szCs w:val="18"/>
+                <w:lang w:val="en-US"/>
+              </w:rPr>
+              <w:t>5</w:t>
+            </w:r>
+            <w:r>
+              <w:rPr>
+                <w:b/>
+                <w:bCs/>
+                <w:sz w:val="18"/>
+                <w:szCs w:val="18"/>
+                <w:lang w:val="en-US"/>
+              </w:rPr>
+              <w:t>6059421</w:t>
             </w:r>
             <w:r>
               <w:rPr>
@@ -1895,8 +1915,6 @@
         </w:tabs>
         <w:jc w:val="center"/>
       </w:pPr>
-      <w:bookmarkStart w:id="0" w:name="_GoBack"/>
-      <w:bookmarkEnd w:id="0"/>
     </w:p>
     <w:p>
       <w:pPr>
@@ -1905,14 +1923,6 @@
         </w:tabs>
         <w:jc w:val="center"/>
       </w:pPr>
-    </w:p>
-    <w:p>
-      <w:pPr>
-        <w:tabs>
-          <w:tab w:val="left" w:pos="567"/>
-        </w:tabs>
-        <w:jc w:val="right"/>
-      </w:pPr>
       <w:r>
         <w:rPr>
           <w:noProof/>
@@ -1920,15 +1930,15 @@
         <mc:AlternateContent>
           <mc:Choice Requires="wps">
             <w:drawing>
-              <wp:anchor distT="0" distB="0" distL="114300" distR="114300" simplePos="0" relativeHeight="251658752" behindDoc="0" locked="0" layoutInCell="1" allowOverlap="1" wp14:anchorId="156A74D4" wp14:editId="1EE0B596">
+              <wp:anchor distT="0" distB="0" distL="114300" distR="114300" simplePos="0" relativeHeight="251658752" behindDoc="0" locked="0" layoutInCell="1" allowOverlap="1" wp14:anchorId="156A74D4" wp14:editId="2CB5638F">
                 <wp:simplePos x="0" y="0"/>
                 <wp:positionH relativeFrom="column">
-                  <wp:posOffset>2274391</wp:posOffset>
+                  <wp:posOffset>2184599</wp:posOffset>
                 </wp:positionH>
                 <wp:positionV relativeFrom="paragraph">
-                  <wp:posOffset>344505</wp:posOffset>
+                  <wp:posOffset>413044</wp:posOffset>
                 </wp:positionV>
-                <wp:extent cx="1207699" cy="1197274"/>
+                <wp:extent cx="1453487" cy="1310185"/>
                 <wp:effectExtent l="0" t="0" r="0" b="0"/>
                 <wp:wrapNone/>
                 <wp:docPr id="1" name="Rectangle 1"/>
@@ -1940,7 +1950,7 @@
                       <wps:spPr>
                         <a:xfrm>
                           <a:off x="0" y="0"/>
-                          <a:ext cx="1207699" cy="1197274"/>
+                          <a:ext cx="1453487" cy="1310185"/>
                         </a:xfrm>
                         <a:prstGeom prst="rect">
                           <a:avLst/>
@@ -1977,10 +1987,10 @@
                                 <w:noProof/>
                               </w:rPr>
                               <w:drawing>
-                                <wp:inline distT="0" distB="0" distL="0" distR="0" wp14:anchorId="4B8FC0EC" wp14:editId="28606718">
-                                  <wp:extent cx="1170940" cy="1235710"/>
+                                <wp:inline distT="0" distB="0" distL="0" distR="0" wp14:anchorId="4B8FC0EC" wp14:editId="3E6F71F5">
+                                  <wp:extent cx="1317008" cy="1389858"/>
                                   <wp:effectExtent l="0" t="0" r="0" b="0"/>
-                                  <wp:docPr id="3" name="Image 3"/>
+                                  <wp:docPr id="2" name="Image 2"/>
                                   <wp:cNvGraphicFramePr>
                                     <a:graphicFrameLocks xmlns:a="http://schemas.openxmlformats.org/drawingml/2006/main" noChangeAspect="1"/>
                                   </wp:cNvGraphicFramePr>
@@ -2006,7 +2016,7 @@
                                         <pic:spPr>
                                           <a:xfrm>
                                             <a:off x="0" y="0"/>
-                                            <a:ext cx="1170940" cy="1235710"/>
+                                            <a:ext cx="1339525" cy="1413620"/>
                                           </a:xfrm>
                                           <a:prstGeom prst="rect">
                                             <a:avLst/>
@@ -2041,7 +2051,7 @@
           </mc:Choice>
           <mc:Fallback>
             <w:pict>
-              <v:rect w14:anchorId="156A74D4" id="Rectangle 1" o:spid="_x0000_s1028" style="position:absolute;left:0;text-align:left;margin-left:179.1pt;margin-top:27.15pt;width:95.1pt;height:94.25pt;z-index:251658752;visibility:visible;mso-wrap-style:square;mso-width-percent:0;mso-height-percent:0;mso-wrap-distance-left:9pt;mso-wrap-distance-top:0;mso-wrap-distance-right:9pt;mso-wrap-distance-bottom:0;mso-position-horizontal:absolute;mso-position-horizontal-relative:text;mso-position-vertical:absolute;mso-position-vertical-relative:text;mso-width-percent:0;mso-height-percent:0;mso-width-relative:margin;mso-height-relative:margin;v-text-anchor:middle" o:gfxdata="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" filled="f" stroked="f" strokeweight="2pt">
+              <v:rect w14:anchorId="156A74D4" id="Rectangle 1" o:spid="_x0000_s1028" style="position:absolute;left:0;text-align:left;margin-left:172pt;margin-top:32.5pt;width:114.45pt;height:103.15pt;z-index:251658752;visibility:visible;mso-wrap-style:square;mso-width-percent:0;mso-height-percent:0;mso-wrap-distance-left:9pt;mso-wrap-distance-top:0;mso-wrap-distance-right:9pt;mso-wrap-distance-bottom:0;mso-position-horizontal:absolute;mso-position-horizontal-relative:text;mso-position-vertical:absolute;mso-position-vertical-relative:text;mso-width-percent:0;mso-height-percent:0;mso-width-relative:margin;mso-height-relative:margin;v-text-anchor:middle" o:gfxdata="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" filled="f" stroked="f" strokeweight="2pt">
                 <v:textbox>
                   <w:txbxContent>
                     <w:p>
@@ -2053,10 +2063,10 @@
                           <w:noProof/>
                         </w:rPr>
                         <w:drawing>
-                          <wp:inline distT="0" distB="0" distL="0" distR="0" wp14:anchorId="4B8FC0EC" wp14:editId="28606718">
-                            <wp:extent cx="1170940" cy="1235710"/>
+                          <wp:inline distT="0" distB="0" distL="0" distR="0" wp14:anchorId="4B8FC0EC" wp14:editId="3E6F71F5">
+                            <wp:extent cx="1317008" cy="1389858"/>
                             <wp:effectExtent l="0" t="0" r="0" b="0"/>
-                            <wp:docPr id="3" name="Image 3"/>
+                            <wp:docPr id="2" name="Image 2"/>
                             <wp:cNvGraphicFramePr>
                               <a:graphicFrameLocks xmlns:a="http://schemas.openxmlformats.org/drawingml/2006/main" noChangeAspect="1"/>
                             </wp:cNvGraphicFramePr>
@@ -2082,7 +2092,7 @@
                                   <pic:spPr>
                                     <a:xfrm>
                                       <a:off x="0" y="0"/>
-                                      <a:ext cx="1170940" cy="1235710"/>
+                                      <a:ext cx="1339525" cy="1413620"/>
                                     </a:xfrm>
                                     <a:prstGeom prst="rect">
                                       <a:avLst/>
@@ -2102,6 +2112,16 @@
           </mc:Fallback>
         </mc:AlternateContent>
       </w:r>
+    </w:p>
+    <w:p>
+      <w:pPr>
+        <w:tabs>
+          <w:tab w:val="left" w:pos="567"/>
+        </w:tabs>
+        <w:jc w:val="right"/>
+      </w:pPr>
+      <w:bookmarkStart w:id="0" w:name="_GoBack"/>
+      <w:bookmarkEnd w:id="0"/>
     </w:p>
     <w:sectPr>
       <w:headerReference w:type="default" r:id="rId10"/>
@@ -2985,7 +3005,7 @@
 </file>
 
 <file path=customXml/itemProps1.xml><?xml version="1.0" encoding="utf-8"?>
-<ds:datastoreItem xmlns:ds="http://schemas.openxmlformats.org/officeDocument/2006/customXml" ds:itemID="{4FC3272F-3940-4A88-B14F-3638529D1A46}">
+<ds:datastoreItem xmlns:ds="http://schemas.openxmlformats.org/officeDocument/2006/customXml" ds:itemID="{2A4000E1-98E0-412E-B368-B650185FE576}">
   <ds:schemaRefs>
     <ds:schemaRef ds:uri="http://schemas.openxmlformats.org/officeDocument/2006/bibliography"/>
   </ds:schemaRefs>

</xml_diff>